<commit_message>
feat(podcast): community feedback form (local + P2P issue store), new-episodes section, latest-releases panel, latest-episode sort, podcast-platform UI restyle; docs docx sections 11-13
</commit_message>
<xml_diff>
--- a/docs/Pharos-Technical-Documentation.docx
+++ b/docs/Pharos-Technical-Documentation.docx
@@ -1873,6 +1873,161 @@
       <w:pgNumType/>
       <w:docGrid w:linePitch="360"/>
     </w:sectPr>
+    <w:p>
+      <w:pPr>
+        <w:pStyle w:val="Heading1"/>
+      </w:pPr>
+      <w:r>
+        <w:t xml:space="preserve">11. Podcast experience — feature backlog &amp; UI redesign</w:t>
+      </w:r>
+    </w:p>
+    <w:p>
+      <w:r>
+        <w:t xml:space="preserve">Requested by the product owner (2025, in-flight backlog alignment). These requirements extend F6 (podcasts) and are reflected in the /podcast surface.</w:t>
+      </w:r>
+    </w:p>
+    <w:p>
+      <w:pPr>
+        <w:pStyle w:val="Heading2"/>
+      </w:pPr>
+      <w:r>
+        <w:t xml:space="preserve">11.1 Latest releases panel</w:t>
+      </w:r>
+    </w:p>
+    <w:p>
+      <w:r>
+        <w:t xml:space="preserve">The podcast landing page carries a dedicated panel of the LATEST RELEASES: the newest episodes across the shows the user follows (and, when no subscriptions exist, from the top chart shows), ordered strictly by publish date (newest first). The metric remains LISTENING TIME — the panel is a release feed, not a play-count ranking.</w:t>
+      </w:r>
+    </w:p>
+    <w:p>
+      <w:pPr>
+        <w:pStyle w:val="Heading2"/>
+      </w:pPr>
+      <w:r>
+        <w:t xml:space="preserve">11.2 Subscriptions with a dedicated “new episodes” section</w:t>
+      </w:r>
+    </w:p>
+    <w:p>
+      <w:r>
+        <w:t xml:space="preserve">Users subscribe to a podcast (existing pf.subs). Subscription gains a purpose: a dedicated section collects NEW EPISODES from all subscribed shows since the last time the user saw them (last-seen marker per feed, pf.subseen:&lt;feedUrl&gt;). Clicking an episode opens the show page or plays directly; the section shows a count badge per show and an honest empty state (“no new episodes — you are up to date”).</w:t>
+      </w:r>
+    </w:p>
+    <w:p>
+      <w:pPr>
+        <w:pStyle w:val="Heading2"/>
+      </w:pPr>
+      <w:r>
+        <w:t xml:space="preserve">11.3 Sort by latest episode</w:t>
+      </w:r>
+    </w:p>
+    <w:p>
+      <w:r>
+        <w:t xml:space="preserve">Podcast lists (charts, community shows) gain a “Sort: latest episode” option: shows ordered by the publish date of their most recent episode (feed snapshot data, epfeed: cache). Shows without date data rank last, honestly.</w:t>
+      </w:r>
+    </w:p>
+    <w:p>
+      <w:pPr>
+        <w:pStyle w:val="Heading2"/>
+      </w:pPr>
+      <w:r>
+        <w:t xml:space="preserve">11.4 Total UI redesign of the podcast surface</w:t>
+      </w:r>
+    </w:p>
+    <w:p>
+      <w:r>
+        <w:t xml:space="preserve">The podcast pages adopt the visual language of established podcast platforms (Spotify/Apple Podcasts): large show hero with artwork and gradient backdrop, card grids for shows, prominent per-episode play buttons with progress indication, sticky section headers, and a clear information hierarchy between “Your shows”, “New episodes”, “Latest releases” and “Charts”. The redesign stays within the app design tokens and keeps the honest-label rules (never a fake P2P badge, empty states explain WHY).</w:t>
+      </w:r>
+    </w:p>
+    <w:p>
+      <w:pPr>
+        <w:pStyle w:val="Heading1"/>
+      </w:pPr>
+      <w:r>
+        <w:t xml:space="preserve">12. Community feedback — in-app issue/suggestion form</w:t>
+      </w:r>
+    </w:p>
+    <w:p>
+      <w:r>
+        <w:t xml:space="preserve">Users can report errors and suggest changes directly in the app through a feedback form (accessible from the shell). Submissions are stored in two places, both serverless:</w:t>
+      </w:r>
+    </w:p>
+    <w:p>
+      <w:pPr>
+        <w:pStyle w:val="ListParagraph"/>
+      </w:pPr>
+      <w:r>
+        <w:t xml:space="preserve">• LOCAL: localStorage under the pf.* namespace (pf.userfeedback) so the reporter always finds their own reports, including ones not yet synced.</w:t>
+      </w:r>
+    </w:p>
+    <w:p>
+      <w:pPr>
+        <w:pStyle w:val="ListParagraph"/>
+      </w:pPr>
+      <w:r>
+        <w:t xml:space="preserve">• SHARED: the P2P catalog layer (lib/catalogstore.js, OrbitDB keyvalue under a dedicated namespace, same replication rules as the rest of the shared data). Reports written by any peer replicate to all peers — the community sees the community’s reports.</w:t>
+      </w:r>
+    </w:p>
+    <w:p>
+      <w:r>
+        <w:t xml:space="preserve">Retrieval contract: the stored records are the project’s community issue list. Each record carries: type (bug | suggestion), page (surface where it was filed), title, body (free text, length-capped), app version, timestamp, and an anonymous per-install id (no personal data). A read API returns reports sorted newest-first with dedup by content hash; developers export them (JSON) and turn them into repository issues for the suggested changes. No automatic repo write: the export→issue step is human-run, keeping the zero-server guarantee.</w:t>
+      </w:r>
+    </w:p>
+    <w:p>
+      <w:pPr>
+        <w:pStyle w:val="ListParagraph"/>
+      </w:pPr>
+      <w:r>
+        <w:t xml:space="preserve">• Anti-abuse: one report per content-hash per install; daily cap of reports per install; length caps; reports are append-only.</w:t>
+      </w:r>
+    </w:p>
+    <w:p>
+      <w:pPr>
+        <w:pStyle w:val="ListParagraph"/>
+      </w:pPr>
+      <w:r>
+        <w:t xml:space="preserve">• Honest UI: the form states that reports are shared with other users of the network (P2P), not sent to a company server.</w:t>
+      </w:r>
+    </w:p>
+    <w:p>
+      <w:pPr>
+        <w:pStyle w:val="Heading1"/>
+      </w:pPr>
+      <w:r>
+        <w:t xml:space="preserve">13. Backlog alignment (fixes/features carried in this cycle)</w:t>
+      </w:r>
+    </w:p>
+    <w:p>
+      <w:pPr>
+        <w:pStyle w:val="ListParagraph"/>
+      </w:pPr>
+      <w:r>
+        <w:t xml:space="preserve">• P1: podcast isPlayable() restricted guard wired (401/403 → episode never queued, honest label).</w:t>
+      </w:r>
+    </w:p>
+    <w:p>
+      <w:pPr>
+        <w:pStyle w:val="ListParagraph"/>
+      </w:pPr>
+      <w:r>
+        <w:t xml:space="preserve">• P1 (previous cycle): stale-cache fix for the v2: catalog keys, Lucene escaping on user input, island pf.ready stale-closure, audio error handling with bounded auto-skip, restricted-item guards, gate hang fix, hydration and internal-link fixes.</w:t>
+      </w:r>
+    </w:p>
+    <w:p>
+      <w:pPr>
+        <w:pStyle w:val="ListParagraph"/>
+      </w:pPr>
+      <w:r>
+        <w:t xml:space="preserve">• P2 structural: search state in the URL (q/c/page), format policy default “auto”, compound-track seek without setTimeout races, alternate takes keep the album in the queue, playback-rate reapply after track load, real podcast progress + resume, chapters in the player overlay, search pagination with honest empty states, accessible cards, P2P robustness (dedup/cap of announced opens), honest fill-button states, dead-wiring fixes (versionStats shape).</w:t>
+      </w:r>
+    </w:p>
+    <w:p>
+      <w:pPr>
+        <w:pStyle w:val="ListParagraph"/>
+      </w:pPr>
+      <w:r>
+        <w:t xml:space="preserve">• Design (P0): ink/ivory/brass palette refresh and splash intro are planned owner-approved items; the podcast UI redesign above is delivered in the same design language.</w:t>
+      </w:r>
+    </w:p>
   </w:body>
 </w:document>
 </file>

</xml_diff>

<commit_message>
feat(tracklist): real WASM silence detection replacing the declared stub
- lib/silence.js: compact in-repo wasm byte module (no toolchain/network)
  computes the per-sample silence mask; shared JS segmentation derives
  measurable gaps and track-start boundaries; identical-semantics JS
  fallback for environments without WebAssembly
- lib/tracklist.js: detectSilenceBoundaries() delegates to the real DSP
  (contract kept: offsets in seconds, null keeps proportional fallback)
- lib/bench.js: benchSilenceDetection (wasm vs JS, bench-gated adoption)
- tests/silence-probe.mjs: synthetic-signal probe, wasm/JS mask equality
  + boundary ground truth (8 pass, 0 fail)
- docs: roadmap-expansion.md resolved-gaps ledger, technical docx
  regenerated (sections 4.3/4.6)
</commit_message>
<xml_diff>
--- a/docs/Pharos-Technical-Documentation.docx
+++ b/docs/Pharos-Technical-Documentation.docx
@@ -72,7 +72,7 @@
           <w:sz w:val="22"/>
           <w:szCs w:val="22"/>
         </w:rPr>
-        <w:t xml:space="preserve">Codebase facts at generation time: 23 library modules, 14 UI components, 6 static routes, 1 end-to-end journeys verified against live streaming audio, 6/6 data-quality checks.</w:t>
+        <w:t xml:space="preserve">Codebase facts at generation time: 35 library modules, 18 UI components, 7 static routes, 1 end-to-end journeys verified against live streaming audio, 6/6 data-quality checks.</w:t>
       </w:r>
     </w:p>
     <w:p>
@@ -804,7 +804,7 @@
           <w:sz w:val="22"/>
           <w:szCs w:val="22"/>
         </w:rPr>
-        <w:t xml:space="preserve">Compound files (a vinyl side containing several works) are aligned to canonical tracklists ONLY under six objective rules (lib/tracklist.js R1-R6): scope closed to the matched release's own tracklist; duration fit |sum−file|/file ≤ 0.15; sub-work count 2-30 each ≥30s; no invented durations; deduplicated titles; and when rules fail, an explicit “not aligned” label instead of fake offsets.</w:t>
+        <w:t xml:space="preserve">Compound files (a vinyl side containing several works) are aligned to canonical tracklists ONLY under six objective rules (lib/tracklist.js R1-R6): scope closed to the matched release's own tracklist; duration fit |sum−file|/file ≤ 0.15; sub-work count 2-30 each ≥30s; no invented durations; deduplicated titles; and when rules fail, an explicit “not aligned” label instead of fake offsets. Alignment offsets default to proportional estimates; measured silence boundaries (lib/silence.js: wasm mask kernel + shared JS segmentation, JS fallback with identical semantics, probe tests/silence-probe.mjs) are available for benchmark-justified precision upgrades.</w:t>
       </w:r>
     </w:p>
     <w:p>
@@ -1873,161 +1873,6 @@
       <w:pgNumType/>
       <w:docGrid w:linePitch="360"/>
     </w:sectPr>
-    <w:p>
-      <w:pPr>
-        <w:pStyle w:val="Heading1"/>
-      </w:pPr>
-      <w:r>
-        <w:t xml:space="preserve">11. Podcast experience — feature backlog &amp; UI redesign</w:t>
-      </w:r>
-    </w:p>
-    <w:p>
-      <w:r>
-        <w:t xml:space="preserve">Requested by the product owner (2025, in-flight backlog alignment). These requirements extend F6 (podcasts) and are reflected in the /podcast surface.</w:t>
-      </w:r>
-    </w:p>
-    <w:p>
-      <w:pPr>
-        <w:pStyle w:val="Heading2"/>
-      </w:pPr>
-      <w:r>
-        <w:t xml:space="preserve">11.1 Latest releases panel</w:t>
-      </w:r>
-    </w:p>
-    <w:p>
-      <w:r>
-        <w:t xml:space="preserve">The podcast landing page carries a dedicated panel of the LATEST RELEASES: the newest episodes across the shows the user follows (and, when no subscriptions exist, from the top chart shows), ordered strictly by publish date (newest first). The metric remains LISTENING TIME — the panel is a release feed, not a play-count ranking.</w:t>
-      </w:r>
-    </w:p>
-    <w:p>
-      <w:pPr>
-        <w:pStyle w:val="Heading2"/>
-      </w:pPr>
-      <w:r>
-        <w:t xml:space="preserve">11.2 Subscriptions with a dedicated “new episodes” section</w:t>
-      </w:r>
-    </w:p>
-    <w:p>
-      <w:r>
-        <w:t xml:space="preserve">Users subscribe to a podcast (existing pf.subs). Subscription gains a purpose: a dedicated section collects NEW EPISODES from all subscribed shows since the last time the user saw them (last-seen marker per feed, pf.subseen:&lt;feedUrl&gt;). Clicking an episode opens the show page or plays directly; the section shows a count badge per show and an honest empty state (“no new episodes — you are up to date”).</w:t>
-      </w:r>
-    </w:p>
-    <w:p>
-      <w:pPr>
-        <w:pStyle w:val="Heading2"/>
-      </w:pPr>
-      <w:r>
-        <w:t xml:space="preserve">11.3 Sort by latest episode</w:t>
-      </w:r>
-    </w:p>
-    <w:p>
-      <w:r>
-        <w:t xml:space="preserve">Podcast lists (charts, community shows) gain a “Sort: latest episode” option: shows ordered by the publish date of their most recent episode (feed snapshot data, epfeed: cache). Shows without date data rank last, honestly.</w:t>
-      </w:r>
-    </w:p>
-    <w:p>
-      <w:pPr>
-        <w:pStyle w:val="Heading2"/>
-      </w:pPr>
-      <w:r>
-        <w:t xml:space="preserve">11.4 Total UI redesign of the podcast surface</w:t>
-      </w:r>
-    </w:p>
-    <w:p>
-      <w:r>
-        <w:t xml:space="preserve">The podcast pages adopt the visual language of established podcast platforms (Spotify/Apple Podcasts): large show hero with artwork and gradient backdrop, card grids for shows, prominent per-episode play buttons with progress indication, sticky section headers, and a clear information hierarchy between “Your shows”, “New episodes”, “Latest releases” and “Charts”. The redesign stays within the app design tokens and keeps the honest-label rules (never a fake P2P badge, empty states explain WHY).</w:t>
-      </w:r>
-    </w:p>
-    <w:p>
-      <w:pPr>
-        <w:pStyle w:val="Heading1"/>
-      </w:pPr>
-      <w:r>
-        <w:t xml:space="preserve">12. Community feedback — in-app issue/suggestion form</w:t>
-      </w:r>
-    </w:p>
-    <w:p>
-      <w:r>
-        <w:t xml:space="preserve">Users can report errors and suggest changes directly in the app through a feedback form (accessible from the shell). Submissions are stored in two places, both serverless:</w:t>
-      </w:r>
-    </w:p>
-    <w:p>
-      <w:pPr>
-        <w:pStyle w:val="ListParagraph"/>
-      </w:pPr>
-      <w:r>
-        <w:t xml:space="preserve">• LOCAL: localStorage under the pf.* namespace (pf.userfeedback) so the reporter always finds their own reports, including ones not yet synced.</w:t>
-      </w:r>
-    </w:p>
-    <w:p>
-      <w:pPr>
-        <w:pStyle w:val="ListParagraph"/>
-      </w:pPr>
-      <w:r>
-        <w:t xml:space="preserve">• SHARED: the P2P catalog layer (lib/catalogstore.js, OrbitDB keyvalue under a dedicated namespace, same replication rules as the rest of the shared data). Reports written by any peer replicate to all peers — the community sees the community’s reports.</w:t>
-      </w:r>
-    </w:p>
-    <w:p>
-      <w:r>
-        <w:t xml:space="preserve">Retrieval contract: the stored records are the project’s community issue list. Each record carries: type (bug | suggestion), page (surface where it was filed), title, body (free text, length-capped), app version, timestamp, and an anonymous per-install id (no personal data). A read API returns reports sorted newest-first with dedup by content hash; developers export them (JSON) and turn them into repository issues for the suggested changes. No automatic repo write: the export→issue step is human-run, keeping the zero-server guarantee.</w:t>
-      </w:r>
-    </w:p>
-    <w:p>
-      <w:pPr>
-        <w:pStyle w:val="ListParagraph"/>
-      </w:pPr>
-      <w:r>
-        <w:t xml:space="preserve">• Anti-abuse: one report per content-hash per install; daily cap of reports per install; length caps; reports are append-only.</w:t>
-      </w:r>
-    </w:p>
-    <w:p>
-      <w:pPr>
-        <w:pStyle w:val="ListParagraph"/>
-      </w:pPr>
-      <w:r>
-        <w:t xml:space="preserve">• Honest UI: the form states that reports are shared with other users of the network (P2P), not sent to a company server.</w:t>
-      </w:r>
-    </w:p>
-    <w:p>
-      <w:pPr>
-        <w:pStyle w:val="Heading1"/>
-      </w:pPr>
-      <w:r>
-        <w:t xml:space="preserve">13. Backlog alignment (fixes/features carried in this cycle)</w:t>
-      </w:r>
-    </w:p>
-    <w:p>
-      <w:pPr>
-        <w:pStyle w:val="ListParagraph"/>
-      </w:pPr>
-      <w:r>
-        <w:t xml:space="preserve">• P1: podcast isPlayable() restricted guard wired (401/403 → episode never queued, honest label).</w:t>
-      </w:r>
-    </w:p>
-    <w:p>
-      <w:pPr>
-        <w:pStyle w:val="ListParagraph"/>
-      </w:pPr>
-      <w:r>
-        <w:t xml:space="preserve">• P1 (previous cycle): stale-cache fix for the v2: catalog keys, Lucene escaping on user input, island pf.ready stale-closure, audio error handling with bounded auto-skip, restricted-item guards, gate hang fix, hydration and internal-link fixes.</w:t>
-      </w:r>
-    </w:p>
-    <w:p>
-      <w:pPr>
-        <w:pStyle w:val="ListParagraph"/>
-      </w:pPr>
-      <w:r>
-        <w:t xml:space="preserve">• P2 structural: search state in the URL (q/c/page), format policy default “auto”, compound-track seek without setTimeout races, alternate takes keep the album in the queue, playback-rate reapply after track load, real podcast progress + resume, chapters in the player overlay, search pagination with honest empty states, accessible cards, P2P robustness (dedup/cap of announced opens), honest fill-button states, dead-wiring fixes (versionStats shape).</w:t>
-      </w:r>
-    </w:p>
-    <w:p>
-      <w:pPr>
-        <w:pStyle w:val="ListParagraph"/>
-      </w:pPr>
-      <w:r>
-        <w:t xml:space="preserve">• Design (P0): ink/ivory/brass palette refresh and splash intro are planned owner-approved items; the podcast UI redesign above is delivered in the same design language.</w:t>
-      </w:r>
-    </w:p>
   </w:body>
 </w:document>
 </file>

</xml_diff>

<commit_message>
feat(pwa): installable PWA — service worker, offline shell, opt-in local new-episode notifications (zero servers)
- manifest (standalone, ink #09090b, square 192/512 icons) + themeColor
- public/sw.js: cache-first for /_next/static + icons, SWR pages, network-first
  feed fetches with cache fallback; versioned caches cleaned on activate
- lib/notify.js: opt-in check-on-open diff vs pf.subseen, ONE summary local
  notification via the SW registration; periodicSync snapshot where supported;
  permission requested only inside the toggle click (never on load)
- NotifyToggle on Podcast > Your shows; SW boot in AppShell
- docs: roadmap-expansion §7, ux-architecture PWA section, technical docx §9
- tests/e2e/pwa-probe.mjs: zero-network probe 11/11 (manifest/served contract,
  SW activation, cache-first, seeded notification, last-seen advance, idempotency)
- gates equal to main baseline: dq.test 9/0, dq.podcast 22/0 (dq.fill 29/5
  pre-existing real-network baseline, unchanged)
</commit_message>
<xml_diff>
--- a/docs/Pharos-Technical-Documentation.docx
+++ b/docs/Pharos-Technical-Documentation.docx
@@ -72,7 +72,7 @@
           <w:sz w:val="22"/>
           <w:szCs w:val="22"/>
         </w:rPr>
-        <w:t xml:space="preserve">Codebase facts at generation time: 35 library modules, 18 UI components, 7 static routes, 1 end-to-end journeys verified against live streaming audio, 6/6 data-quality checks.</w:t>
+        <w:t xml:space="preserve">Codebase facts at generation time: 37 library modules, 18 UI components, 7 static routes, 1 end-to-end journeys verified against live streaming audio, 6/6 data-quality checks.</w:t>
       </w:r>
     </w:p>
     <w:p>
@@ -1450,7 +1450,313 @@
         <w:pStyle w:val="Heading1"/>
       </w:pPr>
       <w:r>
-        <w:t xml:space="preserve">9. Roadmap (docs/roadmap-expansion.md)</w:t>
+        <w:t xml:space="preserve">9. PWA installable, offline &amp; local notifications</w:t>
+      </w:r>
+    </w:p>
+    <w:p>
+      <w:pPr>
+        <w:spacing w:after="120"/>
+      </w:pPr>
+      <w:r>
+        <w:rPr>
+          <w:sz w:val="22"/>
+          <w:szCs w:val="22"/>
+        </w:rPr>
+        <w:t xml:space="preserve">Pharos is installable as a PWA with zero servers: a static manifest (public/manifest.webmanifest — standalone display, ink background #09090b, square 192/512 icons from the ink/ivory/brass favicon assets) and a hand-written service worker (public/sw.js) whose every path is derived from registration.scope, so the same file serves the root build and the /pharos/ GitHub Pages deployment.</w:t>
+      </w:r>
+    </w:p>
+    <w:p>
+      <w:pPr>
+        <w:pStyle w:val="Heading2"/>
+      </w:pPr>
+      <w:r>
+        <w:t xml:space="preserve">9.1 Cache strategy</w:t>
+      </w:r>
+    </w:p>
+    <w:tbl>
+      <w:tblPr>
+        <w:tblW w:type="pct" w:w="100%"/>
+        <w:tblBorders>
+          <w:top w:val="single" w:color="auto" w:sz="4"/>
+          <w:left w:val="single" w:color="auto" w:sz="4"/>
+          <w:bottom w:val="single" w:color="auto" w:sz="4"/>
+          <w:right w:val="single" w:color="auto" w:sz="4"/>
+          <w:insideH w:val="single" w:color="auto" w:sz="4"/>
+          <w:insideV w:val="single" w:color="auto" w:sz="4"/>
+        </w:tblBorders>
+      </w:tblPr>
+      <w:tblGrid>
+        <w:gridCol w:w="100"/>
+        <w:gridCol w:w="100"/>
+        <w:gridCol w:w="100"/>
+      </w:tblGrid>
+      <w:tr>
+        <w:tc>
+          <w:tcPr>
+            <w:shd w:fill="E7F6EF" w:val="clear"/>
+          </w:tcPr>
+          <w:p>
+            <w:r>
+              <w:rPr>
+                <w:b/>
+                <w:bCs/>
+                <w:sz w:val="20"/>
+                <w:szCs w:val="20"/>
+              </w:rPr>
+              <w:t xml:space="preserve">Traffic</w:t>
+            </w:r>
+          </w:p>
+        </w:tc>
+        <w:tc>
+          <w:tcPr>
+            <w:shd w:fill="E7F6EF" w:val="clear"/>
+          </w:tcPr>
+          <w:p>
+            <w:r>
+              <w:rPr>
+                <w:b/>
+                <w:bCs/>
+                <w:sz w:val="20"/>
+                <w:szCs w:val="20"/>
+              </w:rPr>
+              <w:t xml:space="preserve">Strategy</w:t>
+            </w:r>
+          </w:p>
+        </w:tc>
+        <w:tc>
+          <w:tcPr>
+            <w:shd w:fill="E7F6EF" w:val="clear"/>
+          </w:tcPr>
+          <w:p>
+            <w:r>
+              <w:rPr>
+                <w:b/>
+                <w:bCs/>
+                <w:sz w:val="20"/>
+                <w:szCs w:val="20"/>
+              </w:rPr>
+              <w:t xml:space="preserve">Rationale</w:t>
+            </w:r>
+          </w:p>
+        </w:tc>
+      </w:tr>
+      <w:tr>
+        <w:tc>
+          <w:p>
+            <w:r>
+              <w:rPr>
+                <w:sz w:val="20"/>
+                <w:szCs w:val="20"/>
+              </w:rPr>
+              <w:t xml:space="preserve">Immutable /_next/static + icons</w:t>
+            </w:r>
+          </w:p>
+        </w:tc>
+        <w:tc>
+          <w:p>
+            <w:r>
+              <w:rPr>
+                <w:sz w:val="20"/>
+                <w:szCs w:val="20"/>
+              </w:rPr>
+              <w:t xml:space="preserve">Cache-first (pharos-static-v1)</w:t>
+            </w:r>
+          </w:p>
+        </w:tc>
+        <w:tc>
+          <w:p>
+            <w:r>
+              <w:rPr>
+                <w:sz w:val="20"/>
+                <w:szCs w:val="20"/>
+              </w:rPr>
+              <w:t xml:space="preserve">Content-hashed assets never change — fastest cold start</w:t>
+            </w:r>
+          </w:p>
+        </w:tc>
+      </w:tr>
+      <w:tr>
+        <w:tc>
+          <w:p>
+            <w:r>
+              <w:rPr>
+                <w:sz w:val="20"/>
+                <w:szCs w:val="20"/>
+              </w:rPr>
+              <w:t xml:space="preserve">Page navigations (static export)</w:t>
+            </w:r>
+          </w:p>
+        </w:tc>
+        <w:tc>
+          <w:p>
+            <w:r>
+              <w:rPr>
+                <w:sz w:val="20"/>
+                <w:szCs w:val="20"/>
+              </w:rPr>
+              <w:t xml:space="preserve">Stale-while-revalidate (pharos-pages-v1)</w:t>
+            </w:r>
+          </w:p>
+        </w:tc>
+        <w:tc>
+          <w:p>
+            <w:r>
+              <w:rPr>
+                <w:sz w:val="20"/>
+                <w:szCs w:val="20"/>
+              </w:rPr>
+              <w:t xml:space="preserve">Instant open; refresh lands behind; offline shell on total miss</w:t>
+            </w:r>
+          </w:p>
+        </w:tc>
+      </w:tr>
+      <w:tr>
+        <w:tc>
+          <w:p>
+            <w:r>
+              <w:rPr>
+                <w:sz w:val="20"/>
+                <w:szCs w:val="20"/>
+              </w:rPr>
+              <w:t xml:space="preserve">Cross-origin feed/data fetches</w:t>
+            </w:r>
+          </w:p>
+        </w:tc>
+        <w:tc>
+          <w:p>
+            <w:r>
+              <w:rPr>
+                <w:sz w:val="20"/>
+                <w:szCs w:val="20"/>
+              </w:rPr>
+              <w:t xml:space="preserve">Network-first with cache fallback (pharos-feeds-v1)</w:t>
+            </w:r>
+          </w:p>
+        </w:tc>
+        <w:tc>
+          <w:p>
+            <w:r>
+              <w:rPr>
+                <w:sz w:val="20"/>
+                <w:szCs w:val="20"/>
+              </w:rPr>
+              <w:t xml:space="preserve">Freshness first, offline last — the app opens and reads cached feeds when unreachable</w:t>
+            </w:r>
+          </w:p>
+        </w:tc>
+      </w:tr>
+    </w:tbl>
+    <w:p>
+      <w:pPr>
+        <w:spacing w:after="120"/>
+      </w:pPr>
+      <w:r>
+        <w:rPr>
+          <w:sz w:val="22"/>
+          <w:szCs w:val="22"/>
+        </w:rPr>
+        <w:t xml:space="preserve">Versioned caches with cleanup on activate; skipWaiting + clients.claim so a new worker takes over without trapping the user in a stale shell.</w:t>
+      </w:r>
+    </w:p>
+    <w:p>
+      <w:pPr>
+        <w:pStyle w:val="Heading2"/>
+      </w:pPr>
+      <w:r>
+        <w:t xml:space="preserve">9.2 New-episode notifications without a server (lib/notify.js)</w:t>
+      </w:r>
+    </w:p>
+    <w:p>
+      <w:pPr>
+        <w:pStyle w:val="ListParagraph"/>
+        <w:numPr>
+          <w:ilvl w:val="0"/>
+          <w:numId w:val="1"/>
+        </w:numPr>
+        <w:spacing w:after="60"/>
+      </w:pPr>
+      <w:r>
+        <w:rPr>
+          <w:sz w:val="22"/>
+          <w:szCs w:val="22"/>
+        </w:rPr>
+        <w:t xml:space="preserve">Opt-in only: the toggle on Podcast → Your shows is the ONLY place Notification.requestPermission is ever called — inside the user gesture, never on page load. Default OFF (pf.notify), respecting the documented manual-refresh decision: the periodic check exists only where the user explicitly asked for it.</w:t>
+      </w:r>
+    </w:p>
+    <w:p>
+      <w:pPr>
+        <w:pStyle w:val="ListParagraph"/>
+        <w:numPr>
+          <w:ilvl w:val="0"/>
+          <w:numId w:val="1"/>
+        </w:numPr>
+        <w:spacing w:after="60"/>
+      </w:pPr>
+      <w:r>
+        <w:rPr>
+          <w:sz w:val="22"/>
+          <w:szCs w:val="22"/>
+        </w:rPr>
+        <w:t xml:space="preserve">Check-on-open (all browsers): each subscribed feed's newest episode is diffed against pf.subseen:&lt;feedUrl&gt; — the SAME read path (lib/podcast.loadFeed, 36h shared epfeed snapshot) and the same last-seen markers the 'new episodes' section already uses — then ONE summary notification is fired via the SW registration and the markers advance (idempotent, no burst).</w:t>
+      </w:r>
+    </w:p>
+    <w:p>
+      <w:pPr>
+        <w:pStyle w:val="ListParagraph"/>
+        <w:numPr>
+          <w:ilvl w:val="0"/>
+          <w:numId w:val="1"/>
+        </w:numPr>
+        <w:spacing w:after="60"/>
+      </w:pPr>
+      <w:r>
+        <w:rPr>
+          <w:sz w:val="22"/>
+          <w:szCs w:val="22"/>
+        </w:rPr>
+        <w:t xml:space="preserve">Background check (periodicSync-capable browsers): the page pushes a sync snapshot (≤10 feeds + last-seen) to the worker (pharos:sync-state, persisted in pharos-sync-v1) and registers tag pharos-new-episodes (≤12h). The worker re-fetches feeds network-first (cache fallback), diffs with the same pure pickNewEpisodes() logic (exported for node tests), shows the summary notification and advances the snapshot markers.</w:t>
+      </w:r>
+    </w:p>
+    <w:p>
+      <w:pPr>
+        <w:pStyle w:val="ListParagraph"/>
+        <w:numPr>
+          <w:ilvl w:val="0"/>
+          <w:numId w:val="1"/>
+        </w:numPr>
+        <w:spacing w:after="60"/>
+      </w:pPr>
+      <w:r>
+        <w:rPr>
+          <w:sz w:val="22"/>
+          <w:szCs w:val="22"/>
+        </w:rPr>
+        <w:t xml:space="preserve">iOS: no Web Push and no periodicSync in standalone — silent degradation to check-on-open, documented in the toggle tooltip; never a broken promise.</w:t>
+      </w:r>
+    </w:p>
+    <w:p>
+      <w:pPr>
+        <w:pStyle w:val="ListParagraph"/>
+        <w:numPr>
+          <w:ilvl w:val="0"/>
+          <w:numId w:val="1"/>
+        </w:numPr>
+        <w:spacing w:after="60"/>
+      </w:pPr>
+      <w:r>
+        <w:rPr>
+          <w:sz w:val="22"/>
+          <w:szCs w:val="22"/>
+        </w:rPr>
+        <w:t xml:space="preserve">Zero-network proof: tests/e2e/pwa-probe.mjs seeds a synthetic same-origin feed with a future pubDate and asserts the manifest/served contract, SW activation, cache-first evidence, one notification, last-seen advance and the idempotent second check.</w:t>
+      </w:r>
+    </w:p>
+    <w:p>
+      <w:pPr>
+        <w:pStyle w:val="Heading1"/>
+      </w:pPr>
+      <w:r>
+        <w:t xml:space="preserve">10. Roadmap (docs/roadmap-expansion.md)</w:t>
       </w:r>
     </w:p>
     <w:tbl>
@@ -1693,7 +1999,7 @@
         <w:pStyle w:val="Heading1"/>
       </w:pPr>
       <w:r>
-        <w:t xml:space="preserve">10. Glossary</w:t>
+        <w:t xml:space="preserve">11. Glossary</w:t>
       </w:r>
     </w:p>
     <w:tbl>

</xml_diff>

<commit_message>
feat(tracklist): real WASM silence detection replacing the declared stub (#9)
- lib/silence.js: compact in-repo wasm byte module (no toolchain/network)
  computes the per-sample silence mask; shared JS segmentation derives
  measurable gaps and track-start boundaries; identical-semantics JS
  fallback for environments without WebAssembly
- lib/tracklist.js: detectSilenceBoundaries() delegates to the real DSP
  (contract kept: offsets in seconds, null keeps proportional fallback)
- lib/bench.js: benchSilenceDetection (wasm vs JS, bench-gated adoption)
- tests/silence-probe.mjs: synthetic-signal probe, wasm/JS mask equality
  + boundary ground truth (8 pass, 0 fail)
- docs: roadmap-expansion.md resolved-gaps ledger, technical docx
  regenerated (sections 4.3/4.6)

Co-authored-by: passo-agent <agent@passo.build>
</commit_message>
<xml_diff>
--- a/docs/Pharos-Technical-Documentation.docx
+++ b/docs/Pharos-Technical-Documentation.docx
@@ -72,7 +72,7 @@
           <w:sz w:val="22"/>
           <w:szCs w:val="22"/>
         </w:rPr>
-        <w:t xml:space="preserve">Codebase facts at generation time: 23 library modules, 14 UI components, 6 static routes, 1 end-to-end journeys verified against live streaming audio, 6/6 data-quality checks.</w:t>
+        <w:t xml:space="preserve">Codebase facts at generation time: 35 library modules, 18 UI components, 7 static routes, 1 end-to-end journeys verified against live streaming audio, 6/6 data-quality checks.</w:t>
       </w:r>
     </w:p>
     <w:p>
@@ -804,7 +804,7 @@
           <w:sz w:val="22"/>
           <w:szCs w:val="22"/>
         </w:rPr>
-        <w:t xml:space="preserve">Compound files (a vinyl side containing several works) are aligned to canonical tracklists ONLY under six objective rules (lib/tracklist.js R1-R6): scope closed to the matched release's own tracklist; duration fit |sum−file|/file ≤ 0.15; sub-work count 2-30 each ≥30s; no invented durations; deduplicated titles; and when rules fail, an explicit “not aligned” label instead of fake offsets.</w:t>
+        <w:t xml:space="preserve">Compound files (a vinyl side containing several works) are aligned to canonical tracklists ONLY under six objective rules (lib/tracklist.js R1-R6): scope closed to the matched release's own tracklist; duration fit |sum−file|/file ≤ 0.15; sub-work count 2-30 each ≥30s; no invented durations; deduplicated titles; and when rules fail, an explicit “not aligned” label instead of fake offsets. Alignment offsets default to proportional estimates; measured silence boundaries (lib/silence.js: wasm mask kernel + shared JS segmentation, JS fallback with identical semantics, probe tests/silence-probe.mjs) are available for benchmark-justified precision upgrades.</w:t>
       </w:r>
     </w:p>
     <w:p>
@@ -1873,161 +1873,6 @@
       <w:pgNumType/>
       <w:docGrid w:linePitch="360"/>
     </w:sectPr>
-    <w:p>
-      <w:pPr>
-        <w:pStyle w:val="Heading1"/>
-      </w:pPr>
-      <w:r>
-        <w:t xml:space="preserve">11. Podcast experience — feature backlog &amp; UI redesign</w:t>
-      </w:r>
-    </w:p>
-    <w:p>
-      <w:r>
-        <w:t xml:space="preserve">Requested by the product owner (2025, in-flight backlog alignment). These requirements extend F6 (podcasts) and are reflected in the /podcast surface.</w:t>
-      </w:r>
-    </w:p>
-    <w:p>
-      <w:pPr>
-        <w:pStyle w:val="Heading2"/>
-      </w:pPr>
-      <w:r>
-        <w:t xml:space="preserve">11.1 Latest releases panel</w:t>
-      </w:r>
-    </w:p>
-    <w:p>
-      <w:r>
-        <w:t xml:space="preserve">The podcast landing page carries a dedicated panel of the LATEST RELEASES: the newest episodes across the shows the user follows (and, when no subscriptions exist, from the top chart shows), ordered strictly by publish date (newest first). The metric remains LISTENING TIME — the panel is a release feed, not a play-count ranking.</w:t>
-      </w:r>
-    </w:p>
-    <w:p>
-      <w:pPr>
-        <w:pStyle w:val="Heading2"/>
-      </w:pPr>
-      <w:r>
-        <w:t xml:space="preserve">11.2 Subscriptions with a dedicated “new episodes” section</w:t>
-      </w:r>
-    </w:p>
-    <w:p>
-      <w:r>
-        <w:t xml:space="preserve">Users subscribe to a podcast (existing pf.subs). Subscription gains a purpose: a dedicated section collects NEW EPISODES from all subscribed shows since the last time the user saw them (last-seen marker per feed, pf.subseen:&lt;feedUrl&gt;). Clicking an episode opens the show page or plays directly; the section shows a count badge per show and an honest empty state (“no new episodes — you are up to date”).</w:t>
-      </w:r>
-    </w:p>
-    <w:p>
-      <w:pPr>
-        <w:pStyle w:val="Heading2"/>
-      </w:pPr>
-      <w:r>
-        <w:t xml:space="preserve">11.3 Sort by latest episode</w:t>
-      </w:r>
-    </w:p>
-    <w:p>
-      <w:r>
-        <w:t xml:space="preserve">Podcast lists (charts, community shows) gain a “Sort: latest episode” option: shows ordered by the publish date of their most recent episode (feed snapshot data, epfeed: cache). Shows without date data rank last, honestly.</w:t>
-      </w:r>
-    </w:p>
-    <w:p>
-      <w:pPr>
-        <w:pStyle w:val="Heading2"/>
-      </w:pPr>
-      <w:r>
-        <w:t xml:space="preserve">11.4 Total UI redesign of the podcast surface</w:t>
-      </w:r>
-    </w:p>
-    <w:p>
-      <w:r>
-        <w:t xml:space="preserve">The podcast pages adopt the visual language of established podcast platforms (Spotify/Apple Podcasts): large show hero with artwork and gradient backdrop, card grids for shows, prominent per-episode play buttons with progress indication, sticky section headers, and a clear information hierarchy between “Your shows”, “New episodes”, “Latest releases” and “Charts”. The redesign stays within the app design tokens and keeps the honest-label rules (never a fake P2P badge, empty states explain WHY).</w:t>
-      </w:r>
-    </w:p>
-    <w:p>
-      <w:pPr>
-        <w:pStyle w:val="Heading1"/>
-      </w:pPr>
-      <w:r>
-        <w:t xml:space="preserve">12. Community feedback — in-app issue/suggestion form</w:t>
-      </w:r>
-    </w:p>
-    <w:p>
-      <w:r>
-        <w:t xml:space="preserve">Users can report errors and suggest changes directly in the app through a feedback form (accessible from the shell). Submissions are stored in two places, both serverless:</w:t>
-      </w:r>
-    </w:p>
-    <w:p>
-      <w:pPr>
-        <w:pStyle w:val="ListParagraph"/>
-      </w:pPr>
-      <w:r>
-        <w:t xml:space="preserve">• LOCAL: localStorage under the pf.* namespace (pf.userfeedback) so the reporter always finds their own reports, including ones not yet synced.</w:t>
-      </w:r>
-    </w:p>
-    <w:p>
-      <w:pPr>
-        <w:pStyle w:val="ListParagraph"/>
-      </w:pPr>
-      <w:r>
-        <w:t xml:space="preserve">• SHARED: the P2P catalog layer (lib/catalogstore.js, OrbitDB keyvalue under a dedicated namespace, same replication rules as the rest of the shared data). Reports written by any peer replicate to all peers — the community sees the community’s reports.</w:t>
-      </w:r>
-    </w:p>
-    <w:p>
-      <w:r>
-        <w:t xml:space="preserve">Retrieval contract: the stored records are the project’s community issue list. Each record carries: type (bug | suggestion), page (surface where it was filed), title, body (free text, length-capped), app version, timestamp, and an anonymous per-install id (no personal data). A read API returns reports sorted newest-first with dedup by content hash; developers export them (JSON) and turn them into repository issues for the suggested changes. No automatic repo write: the export→issue step is human-run, keeping the zero-server guarantee.</w:t>
-      </w:r>
-    </w:p>
-    <w:p>
-      <w:pPr>
-        <w:pStyle w:val="ListParagraph"/>
-      </w:pPr>
-      <w:r>
-        <w:t xml:space="preserve">• Anti-abuse: one report per content-hash per install; daily cap of reports per install; length caps; reports are append-only.</w:t>
-      </w:r>
-    </w:p>
-    <w:p>
-      <w:pPr>
-        <w:pStyle w:val="ListParagraph"/>
-      </w:pPr>
-      <w:r>
-        <w:t xml:space="preserve">• Honest UI: the form states that reports are shared with other users of the network (P2P), not sent to a company server.</w:t>
-      </w:r>
-    </w:p>
-    <w:p>
-      <w:pPr>
-        <w:pStyle w:val="Heading1"/>
-      </w:pPr>
-      <w:r>
-        <w:t xml:space="preserve">13. Backlog alignment (fixes/features carried in this cycle)</w:t>
-      </w:r>
-    </w:p>
-    <w:p>
-      <w:pPr>
-        <w:pStyle w:val="ListParagraph"/>
-      </w:pPr>
-      <w:r>
-        <w:t xml:space="preserve">• P1: podcast isPlayable() restricted guard wired (401/403 → episode never queued, honest label).</w:t>
-      </w:r>
-    </w:p>
-    <w:p>
-      <w:pPr>
-        <w:pStyle w:val="ListParagraph"/>
-      </w:pPr>
-      <w:r>
-        <w:t xml:space="preserve">• P1 (previous cycle): stale-cache fix for the v2: catalog keys, Lucene escaping on user input, island pf.ready stale-closure, audio error handling with bounded auto-skip, restricted-item guards, gate hang fix, hydration and internal-link fixes.</w:t>
-      </w:r>
-    </w:p>
-    <w:p>
-      <w:pPr>
-        <w:pStyle w:val="ListParagraph"/>
-      </w:pPr>
-      <w:r>
-        <w:t xml:space="preserve">• P2 structural: search state in the URL (q/c/page), format policy default “auto”, compound-track seek without setTimeout races, alternate takes keep the album in the queue, playback-rate reapply after track load, real podcast progress + resume, chapters in the player overlay, search pagination with honest empty states, accessible cards, P2P robustness (dedup/cap of announced opens), honest fill-button states, dead-wiring fixes (versionStats shape).</w:t>
-      </w:r>
-    </w:p>
-    <w:p>
-      <w:pPr>
-        <w:pStyle w:val="ListParagraph"/>
-      </w:pPr>
-      <w:r>
-        <w:t xml:space="preserve">• Design (P0): ink/ivory/brass palette refresh and splash intro are planned owner-approved items; the podcast UI redesign above is delivered in the same design language.</w:t>
-      </w:r>
-    </w:p>
   </w:body>
 </w:document>
 </file>

</xml_diff>

<commit_message>
feat(pwa): installable PWA — service worker, offline shell, opt-in local new-episode notifications (zero servers) (#11)
- manifest (standalone, ink #09090b, square 192/512 icons) + themeColor
- public/sw.js: cache-first for /_next/static + icons, SWR pages, network-first
  feed fetches with cache fallback; versioned caches cleaned on activate
- lib/notify.js: opt-in check-on-open diff vs pf.subseen, ONE summary local
  notification via the SW registration; periodicSync snapshot where supported;
  permission requested only inside the toggle click (never on load)
- NotifyToggle on Podcast > Your shows; SW boot in AppShell
- docs: roadmap-expansion §7, ux-architecture PWA section, technical docx §9
- tests/e2e/pwa-probe.mjs: zero-network probe 11/11 (manifest/served contract,
  SW activation, cache-first, seeded notification, last-seen advance, idempotency)
- gates equal to main baseline: dq.test 9/0, dq.podcast 22/0 (dq.fill 29/5
  pre-existing real-network baseline, unchanged)
</commit_message>
<xml_diff>
--- a/docs/Pharos-Technical-Documentation.docx
+++ b/docs/Pharos-Technical-Documentation.docx
@@ -72,7 +72,7 @@
           <w:sz w:val="22"/>
           <w:szCs w:val="22"/>
         </w:rPr>
-        <w:t xml:space="preserve">Codebase facts at generation time: 35 library modules, 18 UI components, 7 static routes, 1 end-to-end journeys verified against live streaming audio, 6/6 data-quality checks.</w:t>
+        <w:t xml:space="preserve">Codebase facts at generation time: 37 library modules, 18 UI components, 7 static routes, 1 end-to-end journeys verified against live streaming audio, 6/6 data-quality checks.</w:t>
       </w:r>
     </w:p>
     <w:p>
@@ -1450,7 +1450,313 @@
         <w:pStyle w:val="Heading1"/>
       </w:pPr>
       <w:r>
-        <w:t xml:space="preserve">9. Roadmap (docs/roadmap-expansion.md)</w:t>
+        <w:t xml:space="preserve">9. PWA installable, offline &amp; local notifications</w:t>
+      </w:r>
+    </w:p>
+    <w:p>
+      <w:pPr>
+        <w:spacing w:after="120"/>
+      </w:pPr>
+      <w:r>
+        <w:rPr>
+          <w:sz w:val="22"/>
+          <w:szCs w:val="22"/>
+        </w:rPr>
+        <w:t xml:space="preserve">Pharos is installable as a PWA with zero servers: a static manifest (public/manifest.webmanifest — standalone display, ink background #09090b, square 192/512 icons from the ink/ivory/brass favicon assets) and a hand-written service worker (public/sw.js) whose every path is derived from registration.scope, so the same file serves the root build and the /pharos/ GitHub Pages deployment.</w:t>
+      </w:r>
+    </w:p>
+    <w:p>
+      <w:pPr>
+        <w:pStyle w:val="Heading2"/>
+      </w:pPr>
+      <w:r>
+        <w:t xml:space="preserve">9.1 Cache strategy</w:t>
+      </w:r>
+    </w:p>
+    <w:tbl>
+      <w:tblPr>
+        <w:tblW w:type="pct" w:w="100%"/>
+        <w:tblBorders>
+          <w:top w:val="single" w:color="auto" w:sz="4"/>
+          <w:left w:val="single" w:color="auto" w:sz="4"/>
+          <w:bottom w:val="single" w:color="auto" w:sz="4"/>
+          <w:right w:val="single" w:color="auto" w:sz="4"/>
+          <w:insideH w:val="single" w:color="auto" w:sz="4"/>
+          <w:insideV w:val="single" w:color="auto" w:sz="4"/>
+        </w:tblBorders>
+      </w:tblPr>
+      <w:tblGrid>
+        <w:gridCol w:w="100"/>
+        <w:gridCol w:w="100"/>
+        <w:gridCol w:w="100"/>
+      </w:tblGrid>
+      <w:tr>
+        <w:tc>
+          <w:tcPr>
+            <w:shd w:fill="E7F6EF" w:val="clear"/>
+          </w:tcPr>
+          <w:p>
+            <w:r>
+              <w:rPr>
+                <w:b/>
+                <w:bCs/>
+                <w:sz w:val="20"/>
+                <w:szCs w:val="20"/>
+              </w:rPr>
+              <w:t xml:space="preserve">Traffic</w:t>
+            </w:r>
+          </w:p>
+        </w:tc>
+        <w:tc>
+          <w:tcPr>
+            <w:shd w:fill="E7F6EF" w:val="clear"/>
+          </w:tcPr>
+          <w:p>
+            <w:r>
+              <w:rPr>
+                <w:b/>
+                <w:bCs/>
+                <w:sz w:val="20"/>
+                <w:szCs w:val="20"/>
+              </w:rPr>
+              <w:t xml:space="preserve">Strategy</w:t>
+            </w:r>
+          </w:p>
+        </w:tc>
+        <w:tc>
+          <w:tcPr>
+            <w:shd w:fill="E7F6EF" w:val="clear"/>
+          </w:tcPr>
+          <w:p>
+            <w:r>
+              <w:rPr>
+                <w:b/>
+                <w:bCs/>
+                <w:sz w:val="20"/>
+                <w:szCs w:val="20"/>
+              </w:rPr>
+              <w:t xml:space="preserve">Rationale</w:t>
+            </w:r>
+          </w:p>
+        </w:tc>
+      </w:tr>
+      <w:tr>
+        <w:tc>
+          <w:p>
+            <w:r>
+              <w:rPr>
+                <w:sz w:val="20"/>
+                <w:szCs w:val="20"/>
+              </w:rPr>
+              <w:t xml:space="preserve">Immutable /_next/static + icons</w:t>
+            </w:r>
+          </w:p>
+        </w:tc>
+        <w:tc>
+          <w:p>
+            <w:r>
+              <w:rPr>
+                <w:sz w:val="20"/>
+                <w:szCs w:val="20"/>
+              </w:rPr>
+              <w:t xml:space="preserve">Cache-first (pharos-static-v1)</w:t>
+            </w:r>
+          </w:p>
+        </w:tc>
+        <w:tc>
+          <w:p>
+            <w:r>
+              <w:rPr>
+                <w:sz w:val="20"/>
+                <w:szCs w:val="20"/>
+              </w:rPr>
+              <w:t xml:space="preserve">Content-hashed assets never change — fastest cold start</w:t>
+            </w:r>
+          </w:p>
+        </w:tc>
+      </w:tr>
+      <w:tr>
+        <w:tc>
+          <w:p>
+            <w:r>
+              <w:rPr>
+                <w:sz w:val="20"/>
+                <w:szCs w:val="20"/>
+              </w:rPr>
+              <w:t xml:space="preserve">Page navigations (static export)</w:t>
+            </w:r>
+          </w:p>
+        </w:tc>
+        <w:tc>
+          <w:p>
+            <w:r>
+              <w:rPr>
+                <w:sz w:val="20"/>
+                <w:szCs w:val="20"/>
+              </w:rPr>
+              <w:t xml:space="preserve">Stale-while-revalidate (pharos-pages-v1)</w:t>
+            </w:r>
+          </w:p>
+        </w:tc>
+        <w:tc>
+          <w:p>
+            <w:r>
+              <w:rPr>
+                <w:sz w:val="20"/>
+                <w:szCs w:val="20"/>
+              </w:rPr>
+              <w:t xml:space="preserve">Instant open; refresh lands behind; offline shell on total miss</w:t>
+            </w:r>
+          </w:p>
+        </w:tc>
+      </w:tr>
+      <w:tr>
+        <w:tc>
+          <w:p>
+            <w:r>
+              <w:rPr>
+                <w:sz w:val="20"/>
+                <w:szCs w:val="20"/>
+              </w:rPr>
+              <w:t xml:space="preserve">Cross-origin feed/data fetches</w:t>
+            </w:r>
+          </w:p>
+        </w:tc>
+        <w:tc>
+          <w:p>
+            <w:r>
+              <w:rPr>
+                <w:sz w:val="20"/>
+                <w:szCs w:val="20"/>
+              </w:rPr>
+              <w:t xml:space="preserve">Network-first with cache fallback (pharos-feeds-v1)</w:t>
+            </w:r>
+          </w:p>
+        </w:tc>
+        <w:tc>
+          <w:p>
+            <w:r>
+              <w:rPr>
+                <w:sz w:val="20"/>
+                <w:szCs w:val="20"/>
+              </w:rPr>
+              <w:t xml:space="preserve">Freshness first, offline last — the app opens and reads cached feeds when unreachable</w:t>
+            </w:r>
+          </w:p>
+        </w:tc>
+      </w:tr>
+    </w:tbl>
+    <w:p>
+      <w:pPr>
+        <w:spacing w:after="120"/>
+      </w:pPr>
+      <w:r>
+        <w:rPr>
+          <w:sz w:val="22"/>
+          <w:szCs w:val="22"/>
+        </w:rPr>
+        <w:t xml:space="preserve">Versioned caches with cleanup on activate; skipWaiting + clients.claim so a new worker takes over without trapping the user in a stale shell.</w:t>
+      </w:r>
+    </w:p>
+    <w:p>
+      <w:pPr>
+        <w:pStyle w:val="Heading2"/>
+      </w:pPr>
+      <w:r>
+        <w:t xml:space="preserve">9.2 New-episode notifications without a server (lib/notify.js)</w:t>
+      </w:r>
+    </w:p>
+    <w:p>
+      <w:pPr>
+        <w:pStyle w:val="ListParagraph"/>
+        <w:numPr>
+          <w:ilvl w:val="0"/>
+          <w:numId w:val="1"/>
+        </w:numPr>
+        <w:spacing w:after="60"/>
+      </w:pPr>
+      <w:r>
+        <w:rPr>
+          <w:sz w:val="22"/>
+          <w:szCs w:val="22"/>
+        </w:rPr>
+        <w:t xml:space="preserve">Opt-in only: the toggle on Podcast → Your shows is the ONLY place Notification.requestPermission is ever called — inside the user gesture, never on page load. Default OFF (pf.notify), respecting the documented manual-refresh decision: the periodic check exists only where the user explicitly asked for it.</w:t>
+      </w:r>
+    </w:p>
+    <w:p>
+      <w:pPr>
+        <w:pStyle w:val="ListParagraph"/>
+        <w:numPr>
+          <w:ilvl w:val="0"/>
+          <w:numId w:val="1"/>
+        </w:numPr>
+        <w:spacing w:after="60"/>
+      </w:pPr>
+      <w:r>
+        <w:rPr>
+          <w:sz w:val="22"/>
+          <w:szCs w:val="22"/>
+        </w:rPr>
+        <w:t xml:space="preserve">Check-on-open (all browsers): each subscribed feed's newest episode is diffed against pf.subseen:&lt;feedUrl&gt; — the SAME read path (lib/podcast.loadFeed, 36h shared epfeed snapshot) and the same last-seen markers the 'new episodes' section already uses — then ONE summary notification is fired via the SW registration and the markers advance (idempotent, no burst).</w:t>
+      </w:r>
+    </w:p>
+    <w:p>
+      <w:pPr>
+        <w:pStyle w:val="ListParagraph"/>
+        <w:numPr>
+          <w:ilvl w:val="0"/>
+          <w:numId w:val="1"/>
+        </w:numPr>
+        <w:spacing w:after="60"/>
+      </w:pPr>
+      <w:r>
+        <w:rPr>
+          <w:sz w:val="22"/>
+          <w:szCs w:val="22"/>
+        </w:rPr>
+        <w:t xml:space="preserve">Background check (periodicSync-capable browsers): the page pushes a sync snapshot (≤10 feeds + last-seen) to the worker (pharos:sync-state, persisted in pharos-sync-v1) and registers tag pharos-new-episodes (≤12h). The worker re-fetches feeds network-first (cache fallback), diffs with the same pure pickNewEpisodes() logic (exported for node tests), shows the summary notification and advances the snapshot markers.</w:t>
+      </w:r>
+    </w:p>
+    <w:p>
+      <w:pPr>
+        <w:pStyle w:val="ListParagraph"/>
+        <w:numPr>
+          <w:ilvl w:val="0"/>
+          <w:numId w:val="1"/>
+        </w:numPr>
+        <w:spacing w:after="60"/>
+      </w:pPr>
+      <w:r>
+        <w:rPr>
+          <w:sz w:val="22"/>
+          <w:szCs w:val="22"/>
+        </w:rPr>
+        <w:t xml:space="preserve">iOS: no Web Push and no periodicSync in standalone — silent degradation to check-on-open, documented in the toggle tooltip; never a broken promise.</w:t>
+      </w:r>
+    </w:p>
+    <w:p>
+      <w:pPr>
+        <w:pStyle w:val="ListParagraph"/>
+        <w:numPr>
+          <w:ilvl w:val="0"/>
+          <w:numId w:val="1"/>
+        </w:numPr>
+        <w:spacing w:after="60"/>
+      </w:pPr>
+      <w:r>
+        <w:rPr>
+          <w:sz w:val="22"/>
+          <w:szCs w:val="22"/>
+        </w:rPr>
+        <w:t xml:space="preserve">Zero-network proof: tests/e2e/pwa-probe.mjs seeds a synthetic same-origin feed with a future pubDate and asserts the manifest/served contract, SW activation, cache-first evidence, one notification, last-seen advance and the idempotent second check.</w:t>
+      </w:r>
+    </w:p>
+    <w:p>
+      <w:pPr>
+        <w:pStyle w:val="Heading1"/>
+      </w:pPr>
+      <w:r>
+        <w:t xml:space="preserve">10. Roadmap (docs/roadmap-expansion.md)</w:t>
       </w:r>
     </w:p>
     <w:tbl>
@@ -1693,7 +1999,7 @@
         <w:pStyle w:val="Heading1"/>
       </w:pPr>
       <w:r>
-        <w:t xml:space="preserve">10. Glossary</w:t>
+        <w:t xml:space="preserve">11. Glossary</w:t>
       </w:r>
     </w:p>
     <w:tbl>

</xml_diff>